<commit_message>
Update example resume with latest version
Co-Authored-By: Claude Opus 4.6 (1M context) <noreply@anthropic.com>
</commit_message>
<xml_diff>
--- a/examples/Example_Resume_Bruno_Rubio.docx
+++ b/examples/Example_Resume_Bruno_Rubio.docx
@@ -5,7 +5,6 @@
     <w:p>
       <w:pPr>
         <w:pStyle w:val="Heading1"/>
-        <w:spacing w:before="0" w:after="0"/>
       </w:pPr>
       <w:bookmarkStart w:id="0" w:name="X50ff7314df350abc630bdc8b2007868b872c872"/>
       <w:r>
@@ -15,7 +14,6 @@
     <w:p>
       <w:pPr>
         <w:pStyle w:val="FirstParagraph"/>
-        <w:spacing w:before="0" w:after="0"/>
       </w:pPr>
       <w:r>
         <w:t>Houston, TX • 281-515-2339 • bruno.x.rubio@gmail.com</w:t>
@@ -24,12 +22,11 @@
     <w:p>
       <w:pPr>
         <w:pStyle w:val="BodyText"/>
-        <w:spacing w:before="0" w:after="0"/>
       </w:pPr>
       <w:r>
         <w:t xml:space="preserve">LinkedIn: </w:t>
       </w:r>
-      <w:hyperlink r:id="rId6">
+      <w:hyperlink r:id="rId5">
         <w:r>
           <w:rPr>
             <w:rStyle w:val="Hyperlink"/>
@@ -41,26 +38,14 @@
     <w:p>
       <w:pPr>
         <w:pStyle w:val="BodyText"/>
-        <w:spacing w:before="0" w:after="0"/>
-      </w:pPr>
-      <w:r>
-        <w:t>Languages: English • Spanish • Portuguese | Authorized to work in the US for any employer</w:t>
-      </w:r>
-    </w:p>
-    <w:p>
-      <w:pPr>
-        <w:spacing w:after="0"/>
-      </w:pPr>
-      <w:r>
-        <w:pict w14:anchorId="53D17985">
-          <v:rect id="_x0000_i1025" style="width:0;height:1.5pt" o:hralign="center" o:hrstd="t" o:hr="t"/>
-        </w:pict>
+      </w:pPr>
+      <w:r>
+        <w:t>Languages: English • Spanish •| Authorized to work in the US for any employer</w:t>
       </w:r>
     </w:p>
     <w:p>
       <w:pPr>
         <w:pStyle w:val="Heading2"/>
-        <w:spacing w:before="0" w:after="0"/>
       </w:pPr>
       <w:bookmarkStart w:id="1" w:name="professional-summary"/>
       <w:r>
@@ -70,103 +55,14 @@
     <w:p>
       <w:pPr>
         <w:pStyle w:val="FirstParagraph"/>
-        <w:spacing w:before="0" w:after="0"/>
-      </w:pPr>
-      <w:r>
-        <w:rPr>
-          <w:b/>
-          <w:bCs/>
-        </w:rPr>
-        <w:t>8x</w:t>
-      </w:r>
-      <w:r>
-        <w:t xml:space="preserve"> NetSuite-certified Administrator with </w:t>
-      </w:r>
-      <w:r>
-        <w:rPr>
-          <w:b/>
-          <w:bCs/>
-        </w:rPr>
-        <w:t>10+</w:t>
-      </w:r>
-      <w:r>
-        <w:t xml:space="preserve"> years delivering ERP implementations, WMS deployments, and system optimization across manufacturing, distribution, and medical device operations. Career highlights: </w:t>
-      </w:r>
-      <w:r>
-        <w:rPr>
-          <w:b/>
-          <w:bCs/>
-        </w:rPr>
-        <w:t>4</w:t>
-      </w:r>
-      <w:r>
-        <w:t xml:space="preserve"> successful ERP migrations, </w:t>
-      </w:r>
-      <w:r>
-        <w:rPr>
-          <w:b/>
-          <w:bCs/>
-        </w:rPr>
-        <w:t>3</w:t>
-      </w:r>
-      <w:r>
-        <w:t xml:space="preserve"> WMS go-lives, </w:t>
-      </w:r>
-      <w:r>
-        <w:rPr>
-          <w:b/>
-          <w:bCs/>
-        </w:rPr>
-        <w:t>90%+</w:t>
-      </w:r>
-      <w:r>
-        <w:t xml:space="preserve"> reduction in picking errors, and </w:t>
-      </w:r>
-      <w:r>
-        <w:rPr>
-          <w:b/>
-          <w:bCs/>
-        </w:rPr>
-        <w:t>30%</w:t>
-      </w:r>
-      <w:r>
-        <w:t xml:space="preserve"> faster system performance. Trained </w:t>
-      </w:r>
-      <w:r>
-        <w:rPr>
-          <w:b/>
-          <w:bCs/>
-        </w:rPr>
-        <w:t>100+</w:t>
-      </w:r>
-      <w:r>
-        <w:t xml:space="preserve"> users and built </w:t>
-      </w:r>
-      <w:r>
-        <w:rPr>
-          <w:b/>
-          <w:bCs/>
-        </w:rPr>
-        <w:t>30+</w:t>
-      </w:r>
-      <w:r>
-        <w:t xml:space="preserve"> SOPs to drive adoption and audit readiness.</w:t>
-      </w:r>
-    </w:p>
-    <w:p>
-      <w:pPr>
-        <w:spacing w:after="0"/>
-      </w:pPr>
-      <w:r>
-        <w:pict w14:anchorId="53D17986">
-          <v:rect id="_x0000_i1026" style="width:0;height:1.5pt" o:hralign="center" o:hrstd="t" o:hr="t"/>
-        </w:pict>
+      </w:pPr>
+      <w:r>
+        <w:t>8x NetSuite-certified Administrator with 10+ years delivering ERP implementations, WMS deployments, and system optimization across manufacturing, distribution, and medical device operations. Career highlights: 4 successful ERP migrations, 3 WMS go-lives, 90%+ reduction in picking errors, and 30% faster system performance. Trained 100+ users and built 30+ SOPs to drive adoption and audit readiness.</w:t>
       </w:r>
     </w:p>
     <w:p>
       <w:pPr>
         <w:pStyle w:val="Heading2"/>
-        <w:spacing w:before="0" w:after="0"/>
       </w:pPr>
       <w:bookmarkStart w:id="2" w:name="key-achievements"/>
       <w:bookmarkEnd w:id="1"/>
@@ -181,7 +77,6 @@
           <w:ilvl w:val="0"/>
           <w:numId w:val="2"/>
         </w:numPr>
-        <w:spacing w:before="0" w:after="0"/>
       </w:pPr>
       <w:r>
         <w:rPr>
@@ -211,7 +106,6 @@
           <w:ilvl w:val="0"/>
           <w:numId w:val="2"/>
         </w:numPr>
-        <w:spacing w:before="0" w:after="0"/>
       </w:pPr>
       <w:r>
         <w:rPr>
@@ -231,7 +125,7 @@
         <w:t>4</w:t>
       </w:r>
       <w:r>
-        <w:t xml:space="preserve"> platform transitions spanning QuickBooks, Fishbowl, NetSuite, Sage, and Infor CSD</w:t>
+        <w:t xml:space="preserve"> platform transitions spanning QuickBooks, Fishbowl, NetSuite, and Infor CSD</w:t>
       </w:r>
     </w:p>
     <w:p>
@@ -241,7 +135,6 @@
           <w:ilvl w:val="0"/>
           <w:numId w:val="2"/>
         </w:numPr>
-        <w:spacing w:before="0" w:after="0"/>
       </w:pPr>
       <w:r>
         <w:rPr>
@@ -291,7 +184,6 @@
           <w:ilvl w:val="0"/>
           <w:numId w:val="2"/>
         </w:numPr>
-        <w:spacing w:before="0" w:after="0"/>
       </w:pPr>
       <w:r>
         <w:rPr>
@@ -346,18 +238,7 @@
     </w:p>
     <w:p>
       <w:pPr>
-        <w:spacing w:after="0"/>
-      </w:pPr>
-      <w:r>
-        <w:pict w14:anchorId="53D17987">
-          <v:rect id="_x0000_i1027" style="width:0;height:1.5pt" o:hralign="center" o:hrstd="t" o:hr="t"/>
-        </w:pict>
-      </w:r>
-    </w:p>
-    <w:p>
-      <w:pPr>
         <w:pStyle w:val="Heading2"/>
-        <w:spacing w:before="0" w:after="0"/>
       </w:pPr>
       <w:bookmarkStart w:id="3" w:name="professional-experience"/>
       <w:bookmarkEnd w:id="2"/>
@@ -368,27 +249,37 @@
     <w:p>
       <w:pPr>
         <w:pStyle w:val="Heading3"/>
-        <w:spacing w:before="0" w:after="0"/>
-      </w:pPr>
-      <w:bookmarkStart w:id="4" w:name="netsuite-consultant-contract"/>
-      <w:r>
-        <w:t>NetSuite Consultant (Contract)</w:t>
+      </w:pPr>
+      <w:bookmarkStart w:id="4" w:name="netsuite-consultant"/>
+      <w:r>
+        <w:t>NetSuite Consultant</w:t>
       </w:r>
     </w:p>
     <w:p>
       <w:pPr>
         <w:pStyle w:val="FirstParagraph"/>
-        <w:spacing w:before="0" w:after="0"/>
-      </w:pPr>
-      <w:r>
-        <w:rPr>
-          <w:b/>
-          <w:bCs/>
-        </w:rPr>
-        <w:t>RigUp, Inc.</w:t>
-      </w:r>
-      <w:r>
-        <w:t xml:space="preserve"> • Remote • November 2025 – Present</w:t>
+      </w:pPr>
+      <w:r>
+        <w:rPr>
+          <w:b/>
+          <w:bCs/>
+        </w:rPr>
+        <w:t>Urku Consulting, LLC</w:t>
+      </w:r>
+      <w:r>
+        <w:t xml:space="preserve"> • Remote • January 2025 – Present</w:t>
+      </w:r>
+    </w:p>
+    <w:p>
+      <w:pPr>
+        <w:pStyle w:val="BodyText"/>
+      </w:pPr>
+      <w:r>
+        <w:rPr>
+          <w:i/>
+          <w:iCs/>
+        </w:rPr>
+        <w:t>Principal consultant delivering NetSuite implementations for client engagements</w:t>
       </w:r>
     </w:p>
     <w:p>
@@ -398,10 +289,9 @@
           <w:ilvl w:val="0"/>
           <w:numId w:val="3"/>
         </w:numPr>
-        <w:spacing w:before="0" w:after="0"/>
-      </w:pPr>
-      <w:r>
-        <w:t xml:space="preserve">Led Sage to NetSuite implementation for newly acquired company, integrating into existing OneWorld environment of </w:t>
+      </w:pPr>
+      <w:r>
+        <w:t xml:space="preserve">Led legacy ERP to NetSuite implementation for newly acquired company, integrating into existing OneWorld environment of </w:t>
       </w:r>
       <w:r>
         <w:rPr>
@@ -421,7 +311,6 @@
           <w:ilvl w:val="0"/>
           <w:numId w:val="3"/>
         </w:numPr>
-        <w:spacing w:before="0" w:after="0"/>
       </w:pPr>
       <w:r>
         <w:t>Migrated employees, customers, vendors, invoices, vendor bills, and bank details — ensuring business continuity post-acquisition with zero data loss</w:t>
@@ -434,7 +323,6 @@
           <w:ilvl w:val="0"/>
           <w:numId w:val="3"/>
         </w:numPr>
-        <w:spacing w:before="0" w:after="0"/>
       </w:pPr>
       <w:r>
         <w:t xml:space="preserve">Cleaned and validated </w:t>
@@ -457,7 +345,7 @@
         <w:t>99%+</w:t>
       </w:r>
       <w:r>
-        <w:t xml:space="preserve"> accuracy; mapped fields between legacy Sage and NetSuite to align with existing subsidiary structure</w:t>
+        <w:t xml:space="preserve"> accuracy; mapped fields between legacy ERP and NetSuite to align with existing subsidiary structure</w:t>
       </w:r>
     </w:p>
     <w:p>
@@ -467,7 +355,6 @@
           <w:ilvl w:val="0"/>
           <w:numId w:val="3"/>
         </w:numPr>
-        <w:spacing w:before="0" w:after="0"/>
       </w:pPr>
       <w:r>
         <w:t xml:space="preserve">Imported GL balances and </w:t>
@@ -480,37 +367,123 @@
         <w:t>3+ years</w:t>
       </w:r>
       <w:r>
-        <w:t xml:space="preserve"> </w:t>
-      </w:r>
-      <w:r>
-        <w:t>of historical transactions, enabling consolidated reporting within first week of go-live</w:t>
+        <w:t xml:space="preserve"> of historical transactions, enabling consolidated reporting within first week of go-live</w:t>
+      </w:r>
+    </w:p>
+    <w:p>
+      <w:pPr>
+        <w:pStyle w:val="Compact"/>
+        <w:numPr>
+          <w:ilvl w:val="0"/>
+          <w:numId w:val="3"/>
+        </w:numPr>
+      </w:pPr>
+      <w:r>
+        <w:lastRenderedPageBreak/>
+        <w:t>Serve as lead NetSuite consultant for growing medical device operation, translating business requirements into configuration specs for implementation partner</w:t>
+      </w:r>
+    </w:p>
+    <w:p>
+      <w:pPr>
+        <w:pStyle w:val="Compact"/>
+        <w:numPr>
+          <w:ilvl w:val="0"/>
+          <w:numId w:val="3"/>
+        </w:numPr>
+      </w:pPr>
+      <w:r>
+        <w:t xml:space="preserve">Led WMS deployment as internal project manager, coordinating </w:t>
+      </w:r>
+      <w:r>
+        <w:rPr>
+          <w:b/>
+          <w:bCs/>
+        </w:rPr>
+        <w:t>20</w:t>
+      </w:r>
+      <w:r>
+        <w:t xml:space="preserve"> stakeholders and </w:t>
+      </w:r>
+      <w:r>
+        <w:rPr>
+          <w:b/>
+          <w:bCs/>
+        </w:rPr>
+        <w:t>3 warehouse</w:t>
+      </w:r>
+      <w:r>
+        <w:t xml:space="preserve"> locations through training and go-live readiness to successful April 2025 launch</w:t>
+      </w:r>
+    </w:p>
+    <w:p>
+      <w:pPr>
+        <w:pStyle w:val="Compact"/>
+        <w:numPr>
+          <w:ilvl w:val="0"/>
+          <w:numId w:val="3"/>
+        </w:numPr>
+      </w:pPr>
+      <w:r>
+        <w:t>Configured serial and lot tracking with FEFO expiration management — zero compliance issues or expiration incidents since implementation</w:t>
+      </w:r>
+    </w:p>
+    <w:p>
+      <w:pPr>
+        <w:pStyle w:val="Compact"/>
+        <w:numPr>
+          <w:ilvl w:val="0"/>
+          <w:numId w:val="3"/>
+        </w:numPr>
+      </w:pPr>
+      <w:r>
+        <w:t xml:space="preserve">Built SuiteAnalytics dashboards for </w:t>
+      </w:r>
+      <w:r>
+        <w:rPr>
+          <w:b/>
+          <w:bCs/>
+        </w:rPr>
+        <w:t>7</w:t>
+      </w:r>
+      <w:r>
+        <w:t xml:space="preserve"> departments (Finance, Ops, Warehouse, Executive, Sales, Service, Purchasing), replacing email-based coordination and eliminating process delays</w:t>
+      </w:r>
+    </w:p>
+    <w:p>
+      <w:pPr>
+        <w:pStyle w:val="Compact"/>
+        <w:numPr>
+          <w:ilvl w:val="0"/>
+          <w:numId w:val="3"/>
+        </w:numPr>
+      </w:pPr>
+      <w:r>
+        <w:t>Partner with CFO and Controller to refine AP/AR processes, delivering customized reports and saved searches that improved month-end closing accuracy</w:t>
       </w:r>
     </w:p>
     <w:p>
       <w:pPr>
         <w:pStyle w:val="Heading3"/>
-        <w:spacing w:before="0" w:after="0"/>
-      </w:pPr>
-      <w:bookmarkStart w:id="5" w:name="netsuite-consultant-contract-1"/>
+      </w:pPr>
+      <w:bookmarkStart w:id="5" w:name="netsuite-administrator"/>
       <w:bookmarkEnd w:id="4"/>
       <w:r>
-        <w:t>NetSuite Consultant (Contract)</w:t>
+        <w:t>NetSuite Administrator</w:t>
       </w:r>
     </w:p>
     <w:p>
       <w:pPr>
         <w:pStyle w:val="FirstParagraph"/>
-        <w:spacing w:before="0" w:after="0"/>
-      </w:pPr>
-      <w:r>
-        <w:rPr>
-          <w:b/>
-          <w:bCs/>
-        </w:rPr>
-        <w:t>DMI Medical USA, Inc.</w:t>
-      </w:r>
-      <w:r>
-        <w:t xml:space="preserve"> • Remote • January 2025 – Present</w:t>
+      </w:pPr>
+      <w:r>
+        <w:rPr>
+          <w:b/>
+          <w:bCs/>
+        </w:rPr>
+        <w:t>Lightspeed Technologies, Inc.</w:t>
+      </w:r>
+      <w:r>
+        <w:t xml:space="preserve"> • Tualatin, OR • May 2022 – December 2024</w:t>
       </w:r>
     </w:p>
     <w:p>
@@ -520,40 +493,49 @@
           <w:ilvl w:val="0"/>
           <w:numId w:val="4"/>
         </w:numPr>
-        <w:spacing w:before="0" w:after="0"/>
-      </w:pPr>
-      <w:r>
-        <w:t xml:space="preserve">Serve as lead NetSuite consultant for </w:t>
-      </w:r>
-      <w:r>
-        <w:rPr>
-          <w:b/>
-          <w:bCs/>
-        </w:rPr>
-        <w:t>$5M</w:t>
-      </w:r>
-      <w:r>
-        <w:t xml:space="preserve"> medical device operation with </w:t>
-      </w:r>
-      <w:r>
-        <w:rPr>
-          <w:b/>
-          <w:bCs/>
-        </w:rPr>
-        <w:t>3</w:t>
-      </w:r>
-      <w:r>
-        <w:t xml:space="preserve"> subsidiaries and </w:t>
-      </w:r>
-      <w:r>
-        <w:rPr>
-          <w:b/>
-          <w:bCs/>
-        </w:rPr>
-        <w:t>20</w:t>
-      </w:r>
-      <w:r>
-        <w:t xml:space="preserve"> users, translating business requirements into configuration specs for implementation partner</w:t>
+      </w:pPr>
+      <w:r>
+        <w:t xml:space="preserve">Administered NetSuite for </w:t>
+      </w:r>
+      <w:r>
+        <w:rPr>
+          <w:b/>
+          <w:bCs/>
+        </w:rPr>
+        <w:t>$40M</w:t>
+      </w:r>
+      <w:r>
+        <w:t xml:space="preserve"> distribution operation with light manufacturing, supporting </w:t>
+      </w:r>
+      <w:r>
+        <w:rPr>
+          <w:b/>
+          <w:bCs/>
+        </w:rPr>
+        <w:t>60</w:t>
+      </w:r>
+      <w:r>
+        <w:t xml:space="preserve"> users, </w:t>
+      </w:r>
+      <w:r>
+        <w:rPr>
+          <w:b/>
+          <w:bCs/>
+        </w:rPr>
+        <w:t>5,000+</w:t>
+      </w:r>
+      <w:r>
+        <w:t xml:space="preserve"> SKUs, and </w:t>
+      </w:r>
+      <w:r>
+        <w:rPr>
+          <w:b/>
+          <w:bCs/>
+        </w:rPr>
+        <w:t>100+</w:t>
+      </w:r>
+      <w:r>
+        <w:t xml:space="preserve"> assembly items configured in Salesforce CPQ</w:t>
       </w:r>
     </w:p>
     <w:p>
@@ -563,10 +545,9 @@
           <w:ilvl w:val="0"/>
           <w:numId w:val="4"/>
         </w:numPr>
-        <w:spacing w:before="0" w:after="0"/>
-      </w:pPr>
-      <w:r>
-        <w:t xml:space="preserve">Led WMS deployment as internal project manager, coordinating </w:t>
+      </w:pPr>
+      <w:r>
+        <w:t xml:space="preserve">Eliminated </w:t>
       </w:r>
       <w:r>
         <w:rPr>
@@ -576,17 +557,24 @@
         <w:t>20</w:t>
       </w:r>
       <w:r>
-        <w:t xml:space="preserve"> stakeholders and </w:t>
-      </w:r>
-      <w:r>
-        <w:rPr>
-          <w:b/>
-          <w:bCs/>
-        </w:rPr>
-        <w:t>3</w:t>
-      </w:r>
-      <w:r>
-        <w:t xml:space="preserve"> warehouse users through training and go-live readiness to successful April 2025 launch</w:t>
+        <w:t xml:space="preserve"> redundant workflows and modernized </w:t>
+      </w:r>
+      <w:r>
+        <w:rPr>
+          <w:b/>
+          <w:bCs/>
+        </w:rPr>
+        <w:t>40</w:t>
+      </w:r>
+      <w:r>
+        <w:t xml:space="preserve"> legacy scripts, reducing average transaction page load times by </w:t>
+      </w:r>
+      <w:r>
+        <w:rPr>
+          <w:b/>
+          <w:bCs/>
+        </w:rPr>
+        <w:t>30%</w:t>
       </w:r>
     </w:p>
     <w:p>
@@ -596,10 +584,29 @@
           <w:ilvl w:val="0"/>
           <w:numId w:val="4"/>
         </w:numPr>
-        <w:spacing w:before="0" w:after="0"/>
-      </w:pPr>
-      <w:r>
-        <w:t>Configured serial and lot tracking with FEFO expiration management — zero compliance issues or expiration incidents since implementation</w:t>
+      </w:pPr>
+      <w:r>
+        <w:t xml:space="preserve">Configured assembly workflows achieving </w:t>
+      </w:r>
+      <w:r>
+        <w:rPr>
+          <w:b/>
+          <w:bCs/>
+        </w:rPr>
+        <w:t>98%</w:t>
+      </w:r>
+      <w:r>
+        <w:t xml:space="preserve"> inventory availability and </w:t>
+      </w:r>
+      <w:r>
+        <w:rPr>
+          <w:b/>
+          <w:bCs/>
+        </w:rPr>
+        <w:t>97%</w:t>
+      </w:r>
+      <w:r>
+        <w:t xml:space="preserve"> on-time assembly completion during post-COVID supply chain disruptions</w:t>
       </w:r>
     </w:p>
     <w:p>
@@ -609,23 +616,19 @@
           <w:ilvl w:val="0"/>
           <w:numId w:val="4"/>
         </w:numPr>
-        <w:spacing w:before="0" w:after="0"/>
-      </w:pPr>
-      <w:r>
-        <w:t xml:space="preserve">Built SuiteAnalytics dashboards for </w:t>
-      </w:r>
-      <w:r>
-        <w:rPr>
-          <w:b/>
-          <w:bCs/>
-        </w:rPr>
-        <w:t>7</w:t>
-      </w:r>
-      <w:r>
-        <w:t xml:space="preserve"> </w:t>
-      </w:r>
-      <w:r>
-        <w:t>departments (Finance, Ops, Warehouse, Executive, Sales, Service, Purchasing), replacing email-based coordination and eliminating process delays</w:t>
+      </w:pPr>
+      <w:r>
+        <w:t xml:space="preserve">Collaborated with CFO and Controller to validate AP/AR workflows supporting approximately </w:t>
+      </w:r>
+      <w:r>
+        <w:rPr>
+          <w:b/>
+          <w:bCs/>
+        </w:rPr>
+        <w:t>800</w:t>
+      </w:r>
+      <w:r>
+        <w:t xml:space="preserve"> monthly sales orders and invoices</w:t>
       </w:r>
     </w:p>
     <w:p>
@@ -635,18 +638,28 @@
           <w:ilvl w:val="0"/>
           <w:numId w:val="4"/>
         </w:numPr>
-        <w:spacing w:before="0" w:after="0"/>
-      </w:pPr>
-      <w:r>
-        <w:t>Partner with CFO and Controller to refine AP/AR processes, delivering customized reports and saved searches that improved month-end closing accuracy</w:t>
+      </w:pPr>
+      <w:r>
+        <w:t>Supported ongoing WMS operations, leading sandbox testing to ensure compatibility with existing warehouse processes</w:t>
+      </w:r>
+    </w:p>
+    <w:p>
+      <w:pPr>
+        <w:pStyle w:val="Compact"/>
+        <w:numPr>
+          <w:ilvl w:val="0"/>
+          <w:numId w:val="4"/>
+        </w:numPr>
+      </w:pPr>
+      <w:r>
+        <w:t>Led NetSuite to Infor CSD migration, managing user adoption through hands-on training and structured UAT</w:t>
       </w:r>
     </w:p>
     <w:p>
       <w:pPr>
         <w:pStyle w:val="Heading3"/>
-        <w:spacing w:before="0" w:after="0"/>
-      </w:pPr>
-      <w:bookmarkStart w:id="6" w:name="netsuite-administrator"/>
+      </w:pPr>
+      <w:bookmarkStart w:id="6" w:name="netsuite-administrator-1"/>
       <w:bookmarkEnd w:id="5"/>
       <w:r>
         <w:t>NetSuite Administrator</w:t>
@@ -655,17 +668,28 @@
     <w:p>
       <w:pPr>
         <w:pStyle w:val="FirstParagraph"/>
-        <w:spacing w:before="0" w:after="0"/>
-      </w:pPr>
-      <w:r>
-        <w:rPr>
-          <w:b/>
-          <w:bCs/>
-        </w:rPr>
-        <w:t>Lightspeed Technologies, Inc.</w:t>
-      </w:r>
-      <w:r>
-        <w:t xml:space="preserve"> • Tualatin, OR • May 2022 – December 2024</w:t>
+      </w:pPr>
+      <w:r>
+        <w:rPr>
+          <w:b/>
+          <w:bCs/>
+        </w:rPr>
+        <w:t>Distrivision</w:t>
+      </w:r>
+      <w:r>
+        <w:t xml:space="preserve"> • Katy, TX • May 2015 – April 2022</w:t>
+      </w:r>
+    </w:p>
+    <w:p>
+      <w:pPr>
+        <w:pStyle w:val="BodyText"/>
+      </w:pPr>
+      <w:r>
+        <w:rPr>
+          <w:i/>
+          <w:iCs/>
+        </w:rPr>
+        <w:t>Promoted from IT and ERP Support Specialist (2015–2019) to NetSuite Administrator (2019–2022)</w:t>
       </w:r>
     </w:p>
     <w:p>
@@ -675,51 +699,19 @@
           <w:ilvl w:val="0"/>
           <w:numId w:val="5"/>
         </w:numPr>
-        <w:spacing w:before="0" w:after="0"/>
-      </w:pPr>
-      <w:r>
-        <w:lastRenderedPageBreak/>
-        <w:t xml:space="preserve">Administered NetSuite for </w:t>
-      </w:r>
-      <w:r>
-        <w:rPr>
-          <w:b/>
-          <w:bCs/>
-        </w:rPr>
-        <w:t>$40M</w:t>
-      </w:r>
-      <w:r>
-        <w:t xml:space="preserve"> distribution operation with light manufacturing, supporting </w:t>
-      </w:r>
-      <w:r>
-        <w:rPr>
-          <w:b/>
-          <w:bCs/>
-        </w:rPr>
-        <w:t>60</w:t>
-      </w:r>
-      <w:r>
-        <w:t xml:space="preserve"> users, </w:t>
-      </w:r>
-      <w:r>
-        <w:rPr>
-          <w:b/>
-          <w:bCs/>
-        </w:rPr>
-        <w:t>5,000+</w:t>
-      </w:r>
-      <w:r>
-        <w:t xml:space="preserve"> SKUs, and </w:t>
-      </w:r>
-      <w:r>
-        <w:rPr>
-          <w:b/>
-          <w:bCs/>
-        </w:rPr>
-        <w:t>100+</w:t>
-      </w:r>
-      <w:r>
-        <w:t xml:space="preserve"> assembly items configured in Salesforce CPQ</w:t>
+      </w:pPr>
+      <w:r>
+        <w:t xml:space="preserve">Guided company through two ERP migrations (QuickBooks → Fishbowl → NetSuite) over 7-year tenure, coordinating </w:t>
+      </w:r>
+      <w:r>
+        <w:rPr>
+          <w:b/>
+          <w:bCs/>
+        </w:rPr>
+        <w:t>6</w:t>
+      </w:r>
+      <w:r>
+        <w:t xml:space="preserve"> integration partners through 12-month NetSuite implementation</w:t>
       </w:r>
     </w:p>
     <w:p>
@@ -729,37 +721,39 @@
           <w:ilvl w:val="0"/>
           <w:numId w:val="5"/>
         </w:numPr>
-        <w:spacing w:before="0" w:after="0"/>
-      </w:pPr>
-      <w:r>
-        <w:t xml:space="preserve">Eliminated </w:t>
-      </w:r>
-      <w:r>
-        <w:rPr>
-          <w:b/>
-          <w:bCs/>
-        </w:rPr>
-        <w:t>20</w:t>
-      </w:r>
-      <w:r>
-        <w:t xml:space="preserve"> redundant workflows and modernized </w:t>
-      </w:r>
-      <w:r>
-        <w:rPr>
-          <w:b/>
-          <w:bCs/>
-        </w:rPr>
-        <w:t>40</w:t>
-      </w:r>
-      <w:r>
-        <w:t xml:space="preserve"> legacy scripts, reducing average transaction page load times by </w:t>
-      </w:r>
-      <w:r>
-        <w:rPr>
-          <w:b/>
-          <w:bCs/>
-        </w:rPr>
-        <w:t>30%</w:t>
+      </w:pPr>
+      <w:r>
+        <w:t xml:space="preserve">Supported company growth from </w:t>
+      </w:r>
+      <w:r>
+        <w:rPr>
+          <w:b/>
+          <w:bCs/>
+        </w:rPr>
+        <w:t>$300K to $5M</w:t>
+      </w:r>
+      <w:r>
+        <w:t xml:space="preserve"> revenue (</w:t>
+      </w:r>
+      <w:r>
+        <w:rPr>
+          <w:b/>
+          <w:bCs/>
+        </w:rPr>
+        <w:t>17x</w:t>
+      </w:r>
+      <w:r>
+        <w:t xml:space="preserve">) while scaling user base from </w:t>
+      </w:r>
+      <w:r>
+        <w:rPr>
+          <w:b/>
+          <w:bCs/>
+        </w:rPr>
+        <w:t>3 to 20</w:t>
+      </w:r>
+      <w:r>
+        <w:t xml:space="preserve"> users</w:t>
       </w:r>
     </w:p>
     <w:p>
@@ -769,30 +763,30 @@
           <w:ilvl w:val="0"/>
           <w:numId w:val="5"/>
         </w:numPr>
-        <w:spacing w:before="0" w:after="0"/>
-      </w:pPr>
-      <w:r>
-        <w:t xml:space="preserve">Configured assembly workflows achieving </w:t>
-      </w:r>
-      <w:r>
-        <w:rPr>
-          <w:b/>
-          <w:bCs/>
-        </w:rPr>
-        <w:t>98%</w:t>
-      </w:r>
-      <w:r>
-        <w:t xml:space="preserve"> inventory availability and </w:t>
-      </w:r>
-      <w:r>
-        <w:rPr>
-          <w:b/>
-          <w:bCs/>
-        </w:rPr>
-        <w:t>97%</w:t>
-      </w:r>
-      <w:r>
-        <w:t xml:space="preserve"> on-time assembly completion during post-COVID supply chain disruptions</w:t>
+      </w:pPr>
+      <w:r>
+        <w:lastRenderedPageBreak/>
+        <w:t xml:space="preserve">Architected standardized SKU nomenclature for </w:t>
+      </w:r>
+      <w:r>
+        <w:rPr>
+          <w:b/>
+          <w:bCs/>
+        </w:rPr>
+        <w:t>2,500+</w:t>
+      </w:r>
+      <w:r>
+        <w:t xml:space="preserve"> SKU garment catalog, embedding key attributes (style, color, size) and reducing picking errors from </w:t>
+      </w:r>
+      <w:r>
+        <w:rPr>
+          <w:b/>
+          <w:bCs/>
+        </w:rPr>
+        <w:t>8-10% to less than 1%</w:t>
+      </w:r>
+      <w:r>
+        <w:t xml:space="preserve"> — enabling scanner-based fulfillment</w:t>
       </w:r>
     </w:p>
     <w:p>
@@ -802,20 +796,39 @@
           <w:ilvl w:val="0"/>
           <w:numId w:val="5"/>
         </w:numPr>
-        <w:spacing w:before="0" w:after="0"/>
-      </w:pPr>
-      <w:r>
-        <w:t xml:space="preserve">Collaborated with CFO and Controller to validate AP/AR workflows supporting approximately </w:t>
-      </w:r>
-      <w:r>
-        <w:rPr>
-          <w:b/>
-          <w:bCs/>
-        </w:rPr>
-        <w:t>800</w:t>
-      </w:r>
-      <w:r>
-        <w:t xml:space="preserve"> monthly sales orders and invoices</w:t>
+      </w:pPr>
+      <w:r>
+        <w:t xml:space="preserve">Managed </w:t>
+      </w:r>
+      <w:r>
+        <w:rPr>
+          <w:b/>
+          <w:bCs/>
+        </w:rPr>
+        <w:t>6</w:t>
+      </w:r>
+      <w:r>
+        <w:t xml:space="preserve"> platform integrations (Avalara, Stripe, Shopify, Celigo, Pacejet, Envoy B2B) processing </w:t>
+      </w:r>
+      <w:r>
+        <w:rPr>
+          <w:b/>
+          <w:bCs/>
+        </w:rPr>
+        <w:t>500–1,000</w:t>
+      </w:r>
+      <w:r>
+        <w:t xml:space="preserve"> transactions monthly with </w:t>
+      </w:r>
+      <w:r>
+        <w:rPr>
+          <w:b/>
+          <w:bCs/>
+        </w:rPr>
+        <w:t>less than 1%</w:t>
+      </w:r>
+      <w:r>
+        <w:t xml:space="preserve"> sync failure rate</w:t>
       </w:r>
     </w:p>
     <w:p>
@@ -825,10 +838,19 @@
           <w:ilvl w:val="0"/>
           <w:numId w:val="5"/>
         </w:numPr>
-        <w:spacing w:before="0" w:after="0"/>
-      </w:pPr>
-      <w:r>
-        <w:t>Supported ongoing WMS operations, leading sandbox testing to ensure compatibility with existing warehouse processes</w:t>
+      </w:pPr>
+      <w:r>
+        <w:t xml:space="preserve">Led WMS deployment for distribution facility, enabling scanner-based picking and inventory management for </w:t>
+      </w:r>
+      <w:r>
+        <w:rPr>
+          <w:b/>
+          <w:bCs/>
+        </w:rPr>
+        <w:t>3</w:t>
+      </w:r>
+      <w:r>
+        <w:t xml:space="preserve"> warehouse locations</w:t>
       </w:r>
     </w:p>
     <w:p>
@@ -838,394 +860,142 @@
           <w:ilvl w:val="0"/>
           <w:numId w:val="5"/>
         </w:numPr>
-        <w:spacing w:before="0" w:after="0"/>
-      </w:pPr>
-      <w:r>
-        <w:t>Led NetSuite to Infor CSD migration, managing user adoption through hands-on training and structured UAT</w:t>
-      </w:r>
-    </w:p>
-    <w:p>
-      <w:pPr>
-        <w:pStyle w:val="Heading3"/>
-        <w:spacing w:before="0" w:after="0"/>
-      </w:pPr>
-      <w:bookmarkStart w:id="7" w:name="netsuite-administrator-1"/>
+      </w:pPr>
+      <w:r>
+        <w:t xml:space="preserve">Trained </w:t>
+      </w:r>
+      <w:r>
+        <w:rPr>
+          <w:b/>
+          <w:bCs/>
+        </w:rPr>
+        <w:t>10</w:t>
+      </w:r>
+      <w:r>
+        <w:t xml:space="preserve"> users during implementation plus ongoing onboarding, driving platform adoption company-wide</w:t>
+      </w:r>
+    </w:p>
+    <w:p>
+      <w:pPr>
+        <w:pStyle w:val="Heading2"/>
+      </w:pPr>
+      <w:bookmarkStart w:id="7" w:name="certifications"/>
+      <w:bookmarkEnd w:id="3"/>
       <w:bookmarkEnd w:id="6"/>
       <w:r>
-        <w:t>NetSuite Administrator</w:t>
+        <w:t>CERTIFICATIONS</w:t>
       </w:r>
     </w:p>
     <w:p>
       <w:pPr>
         <w:pStyle w:val="FirstParagraph"/>
-        <w:spacing w:before="0" w:after="0"/>
-      </w:pPr>
-      <w:r>
-        <w:rPr>
-          <w:b/>
-          <w:bCs/>
-        </w:rPr>
-        <w:t>Distrivision</w:t>
-      </w:r>
-      <w:r>
-        <w:t xml:space="preserve"> • Katy, TX • May 2015 – April 2022</w:t>
+      </w:pPr>
+      <w:r>
+        <w:t>NetSuite Administrator • ERP Consultant • SuiteFoundation • SuiteAnalytics User</w:t>
       </w:r>
     </w:p>
     <w:p>
       <w:pPr>
         <w:pStyle w:val="BodyText"/>
-        <w:spacing w:before="0" w:after="0"/>
-      </w:pPr>
-      <w:r>
-        <w:rPr>
-          <w:i/>
-          <w:iCs/>
-        </w:rPr>
-        <w:t>Promoted from IT and ERP Support Specialist (2015–2019) to NetSuite Administrator (2019–2022)</w:t>
-      </w:r>
-    </w:p>
-    <w:p>
-      <w:pPr>
-        <w:pStyle w:val="Compact"/>
-        <w:numPr>
-          <w:ilvl w:val="0"/>
-          <w:numId w:val="6"/>
-        </w:numPr>
-        <w:spacing w:before="0" w:after="0"/>
-      </w:pPr>
-      <w:r>
-        <w:t xml:space="preserve">Guided company through two ERP migrations (QuickBooks → Fishbowl → NetSuite) over 7-year tenure, coordinating </w:t>
-      </w:r>
-      <w:r>
-        <w:rPr>
-          <w:b/>
-          <w:bCs/>
-        </w:rPr>
-        <w:t>6</w:t>
-      </w:r>
-      <w:r>
-        <w:t xml:space="preserve"> integration partners through 12-month NetSuite implementation</w:t>
-      </w:r>
-    </w:p>
-    <w:p>
-      <w:pPr>
-        <w:pStyle w:val="Compact"/>
-        <w:numPr>
-          <w:ilvl w:val="0"/>
-          <w:numId w:val="6"/>
-        </w:numPr>
-        <w:spacing w:before="0" w:after="0"/>
-      </w:pPr>
-      <w:r>
-        <w:t xml:space="preserve">Supported company growth from </w:t>
-      </w:r>
-      <w:r>
-        <w:rPr>
-          <w:b/>
-          <w:bCs/>
-        </w:rPr>
-        <w:t>$300K to $5M</w:t>
-      </w:r>
-      <w:r>
-        <w:t xml:space="preserve"> revenue (</w:t>
-      </w:r>
-      <w:r>
-        <w:rPr>
-          <w:b/>
-          <w:bCs/>
-        </w:rPr>
-        <w:t>17x</w:t>
-      </w:r>
-      <w:r>
-        <w:t xml:space="preserve">) while scaling user base from </w:t>
-      </w:r>
-      <w:r>
-        <w:rPr>
-          <w:b/>
-          <w:bCs/>
-        </w:rPr>
-        <w:t>3 to 20</w:t>
-      </w:r>
-      <w:r>
-        <w:t xml:space="preserve"> users</w:t>
-      </w:r>
-    </w:p>
-    <w:p>
-      <w:pPr>
-        <w:pStyle w:val="Compact"/>
-        <w:numPr>
-          <w:ilvl w:val="0"/>
-          <w:numId w:val="6"/>
-        </w:numPr>
-        <w:spacing w:before="0" w:after="0"/>
-      </w:pPr>
-      <w:r>
-        <w:t xml:space="preserve">Architected standardized SKU nomenclature for </w:t>
-      </w:r>
-      <w:r>
-        <w:rPr>
-          <w:b/>
-          <w:bCs/>
-        </w:rPr>
-        <w:t>2,500+</w:t>
-      </w:r>
-      <w:r>
-        <w:t xml:space="preserve"> SKU garment catalog, embedding key attributes (style, color, size) and reducing picking errors from </w:t>
-      </w:r>
-      <w:r>
-        <w:rPr>
-          <w:b/>
-          <w:bCs/>
-        </w:rPr>
-        <w:t>8-10% to less than 1%</w:t>
-      </w:r>
-      <w:r>
-        <w:t xml:space="preserve"> — enabling scanner-based fulfillment</w:t>
-      </w:r>
-    </w:p>
-    <w:p>
-      <w:pPr>
-        <w:pStyle w:val="Compact"/>
-        <w:numPr>
-          <w:ilvl w:val="0"/>
-          <w:numId w:val="6"/>
-        </w:numPr>
-        <w:spacing w:before="0" w:after="0"/>
-      </w:pPr>
-      <w:r>
-        <w:t xml:space="preserve">Managed </w:t>
-      </w:r>
-      <w:r>
-        <w:rPr>
-          <w:b/>
-          <w:bCs/>
-        </w:rPr>
-        <w:t>6</w:t>
-      </w:r>
-      <w:r>
-        <w:t xml:space="preserve"> platform integrations (Avalara, Stripe, Shopify, Celigo, Pacejet, Envoy B2B) processing </w:t>
-      </w:r>
-      <w:r>
-        <w:rPr>
-          <w:b/>
-          <w:bCs/>
-        </w:rPr>
-        <w:t>500–1,000</w:t>
-      </w:r>
-      <w:r>
-        <w:t xml:space="preserve"> transactions monthly with </w:t>
-      </w:r>
-      <w:r>
-        <w:rPr>
-          <w:b/>
-          <w:bCs/>
-        </w:rPr>
-        <w:t>less than 1%</w:t>
-      </w:r>
-      <w:r>
-        <w:t xml:space="preserve"> sync failure rate</w:t>
-      </w:r>
-    </w:p>
-    <w:p>
-      <w:pPr>
-        <w:pStyle w:val="Compact"/>
-        <w:numPr>
-          <w:ilvl w:val="0"/>
-          <w:numId w:val="6"/>
-        </w:numPr>
-        <w:spacing w:before="0" w:after="0"/>
-      </w:pPr>
-      <w:r>
-        <w:t xml:space="preserve">Led WMS deployment for distribution facility, enabling scanner-based picking and inventory management for </w:t>
-      </w:r>
-      <w:r>
-        <w:rPr>
-          <w:b/>
-          <w:bCs/>
-        </w:rPr>
-        <w:t>3</w:t>
-      </w:r>
-      <w:r>
-        <w:t xml:space="preserve"> warehouse users</w:t>
-      </w:r>
-    </w:p>
-    <w:p>
-      <w:pPr>
-        <w:pStyle w:val="Compact"/>
-        <w:numPr>
-          <w:ilvl w:val="0"/>
-          <w:numId w:val="6"/>
-        </w:numPr>
-        <w:spacing w:before="0" w:after="0"/>
-      </w:pPr>
-      <w:r>
-        <w:t xml:space="preserve">Trained </w:t>
-      </w:r>
-      <w:r>
-        <w:rPr>
-          <w:b/>
-          <w:bCs/>
-        </w:rPr>
-        <w:t>10</w:t>
-      </w:r>
-      <w:r>
-        <w:t xml:space="preserve"> users during implementation plus ongoing onboarding, driving platform adoption company-wide</w:t>
-      </w:r>
-    </w:p>
-    <w:p>
-      <w:pPr>
-        <w:spacing w:after="0"/>
-      </w:pPr>
-      <w:r>
-        <w:pict w14:anchorId="53D17988">
-          <v:rect id="_x0000_i1028" style="width:0;height:1.5pt" o:hralign="center" o:hrstd="t" o:hr="t"/>
-        </w:pict>
+      </w:pPr>
+      <w:r>
+        <w:t>Financial User • Financial Associate • BI and Reporting Associate • AI Foundations Associate</w:t>
       </w:r>
     </w:p>
     <w:p>
       <w:pPr>
         <w:pStyle w:val="Heading2"/>
-        <w:spacing w:before="0" w:after="0"/>
-      </w:pPr>
-      <w:bookmarkStart w:id="8" w:name="certifications"/>
+      </w:pPr>
+      <w:bookmarkStart w:id="8" w:name="core-competencies"/>
       <w:bookmarkEnd w:id="7"/>
-      <w:bookmarkEnd w:id="3"/>
-      <w:r>
-        <w:t>CERTIFICATIONS</w:t>
+      <w:r>
+        <w:t>CORE COMPETENCIES</w:t>
       </w:r>
     </w:p>
     <w:p>
       <w:pPr>
         <w:pStyle w:val="FirstParagraph"/>
-        <w:spacing w:before="0" w:after="0"/>
-      </w:pPr>
-      <w:r>
-        <w:t>NetSuite Administrator • ERP Consultant • SuiteFoundation • SuiteAnalytics User</w:t>
+      </w:pPr>
+      <w:r>
+        <w:rPr>
+          <w:b/>
+          <w:bCs/>
+        </w:rPr>
+        <w:t>ERP &amp; Configuration:</w:t>
+      </w:r>
+      <w:r>
+        <w:t xml:space="preserve"> NetSuite Administration • Workflow Automation • SuiteAnalytics • Saved Searches • SuiteScript 2.1 (Functional)</w:t>
       </w:r>
     </w:p>
     <w:p>
       <w:pPr>
         <w:pStyle w:val="BodyText"/>
-        <w:spacing w:before="0" w:after="0"/>
-      </w:pPr>
-      <w:r>
-        <w:t>Financial User • Financial Associate • BI and Reporting Associate • AI Foundations Associate</w:t>
-      </w:r>
-    </w:p>
-    <w:p>
-      <w:pPr>
-        <w:spacing w:after="0"/>
-      </w:pPr>
-      <w:r>
-        <w:pict w14:anchorId="53D17989">
-          <v:rect id="_x0000_i1029" style="width:0;height:1.5pt" o:hralign="center" o:hrstd="t" o:hr="t"/>
-        </w:pict>
-      </w:r>
-    </w:p>
-    <w:p>
-      <w:pPr>
-        <w:pStyle w:val="Heading2"/>
-        <w:spacing w:before="0" w:after="0"/>
-      </w:pPr>
-      <w:bookmarkStart w:id="9" w:name="core-competencies"/>
+      </w:pPr>
+      <w:r>
+        <w:rPr>
+          <w:b/>
+          <w:bCs/>
+        </w:rPr>
+        <w:t>Finance Support:</w:t>
+      </w:r>
+      <w:r>
+        <w:t xml:space="preserve"> AP/AR Process Optimization • P2P &amp; O2C Workflows • Financial Reporting • Multi-Subsidiary (OneWorld)</w:t>
+      </w:r>
+    </w:p>
+    <w:p>
+      <w:pPr>
+        <w:pStyle w:val="BodyText"/>
+      </w:pPr>
+      <w:r>
+        <w:rPr>
+          <w:b/>
+          <w:bCs/>
+        </w:rPr>
+        <w:t>Inventory &amp; Warehouse:</w:t>
+      </w:r>
+      <w:r>
+        <w:t xml:space="preserve"> WMS Deployments • Serial &amp; Lot Tracking • FEFO / Expiration Management • Assembly Builds</w:t>
+      </w:r>
+    </w:p>
+    <w:p>
+      <w:pPr>
+        <w:pStyle w:val="BodyText"/>
+      </w:pPr>
+      <w:r>
+        <w:rPr>
+          <w:b/>
+          <w:bCs/>
+        </w:rPr>
+        <w:t>Implementation:</w:t>
+      </w:r>
+      <w:r>
+        <w:t xml:space="preserve"> ERP Migrations • Data Migration &amp; Cleaning • Field Mapping • SOP Development • User Training • UAT</w:t>
+      </w:r>
+    </w:p>
+    <w:p>
+      <w:pPr>
+        <w:pStyle w:val="BodyText"/>
+      </w:pPr>
+      <w:r>
+        <w:rPr>
+          <w:b/>
+          <w:bCs/>
+        </w:rPr>
+        <w:t>Integrations:</w:t>
+      </w:r>
+      <w:r>
+        <w:t xml:space="preserve"> Shopify • Stripe • Avalara • Salesforce • Celigo • Pacejet • Envoy B2B • Infor CSD</w:t>
+      </w:r>
+      <w:bookmarkEnd w:id="0"/>
       <w:bookmarkEnd w:id="8"/>
-      <w:r>
-        <w:t>CORE COMPETENCIES</w:t>
-      </w:r>
-    </w:p>
-    <w:p>
-      <w:pPr>
-        <w:pStyle w:val="FirstParagraph"/>
-        <w:spacing w:before="0" w:after="0"/>
-      </w:pPr>
-      <w:r>
-        <w:rPr>
-          <w:b/>
-          <w:bCs/>
-        </w:rPr>
-        <w:t>ERP &amp; Configuration:</w:t>
-      </w:r>
-      <w:r>
-        <w:t xml:space="preserve"> NetSuite Administration • Workflow Automation • SuiteAnalytics • Saved Searches • SuiteScript 2.1 (Functional)</w:t>
-      </w:r>
-    </w:p>
-    <w:p>
-      <w:pPr>
-        <w:pStyle w:val="BodyText"/>
-        <w:spacing w:before="0" w:after="0"/>
-      </w:pPr>
-      <w:r>
-        <w:rPr>
-          <w:b/>
-          <w:bCs/>
-        </w:rPr>
-        <w:t>Finance Support:</w:t>
-      </w:r>
-      <w:r>
-        <w:t xml:space="preserve"> AP/AR Process Optimization • P2P &amp; O2C Workflows • Financial Reporting • Multi-Subsidiary (OneWorld)</w:t>
-      </w:r>
-    </w:p>
-    <w:p>
-      <w:pPr>
-        <w:pStyle w:val="BodyText"/>
-        <w:spacing w:before="0" w:after="0"/>
-      </w:pPr>
-      <w:r>
-        <w:rPr>
-          <w:b/>
-          <w:bCs/>
-        </w:rPr>
-        <w:t>Inventory &amp; Warehouse:</w:t>
-      </w:r>
-      <w:r>
-        <w:t xml:space="preserve"> </w:t>
-      </w:r>
-      <w:r>
-        <w:t>WMS Deployments • Serial &amp; Lot Tracking • FEFO / Expiration Management • Assembly Builds</w:t>
-      </w:r>
-    </w:p>
-    <w:p>
-      <w:pPr>
-        <w:pStyle w:val="BodyText"/>
-        <w:spacing w:before="0" w:after="0"/>
-      </w:pPr>
-      <w:r>
-        <w:rPr>
-          <w:b/>
-          <w:bCs/>
-        </w:rPr>
-        <w:t>Implementation:</w:t>
-      </w:r>
-      <w:r>
-        <w:t xml:space="preserve"> ERP Migrations • Data Migration &amp; Cleaning • Field Mapping • SOP Development • User Training • UAT</w:t>
-      </w:r>
-    </w:p>
-    <w:p>
-      <w:pPr>
-        <w:pStyle w:val="BodyText"/>
-        <w:spacing w:before="0" w:after="0"/>
-      </w:pPr>
-      <w:r>
-        <w:rPr>
-          <w:b/>
-          <w:bCs/>
-        </w:rPr>
-        <w:t>Integrations:</w:t>
-      </w:r>
-      <w:r>
-        <w:t xml:space="preserve"> Shopify • Stripe • Avalara • Salesforce • Celigo • Pacejet • Envoy B2B • Sage • Infor CSD</w:t>
-      </w:r>
-    </w:p>
-    <w:bookmarkEnd w:id="9"/>
-    <w:bookmarkEnd w:id="0"/>
+    </w:p>
     <w:sectPr>
       <w:footnotePr>
         <w:numRestart w:val="eachSect"/>
       </w:footnotePr>
       <w:pgSz w:w="12240" w:h="15840"/>
-      <w:pgMar w:top="720" w:right="720" w:bottom="720" w:left="720" w:header="720" w:footer="720" w:gutter="0"/>
+      <w:pgMar w:top="1440" w:right="1440" w:bottom="1440" w:left="1440" w:header="720" w:footer="720" w:gutter="0"/>
       <w:cols w:space="720"/>
-      <w:docGrid w:linePitch="326"/>
     </w:sectPr>
   </w:body>
 </w:document>
@@ -1236,7 +1006,7 @@
   <w:abstractNum w:abstractNumId="0" w15:restartNumberingAfterBreak="0">
     <w:nsid w:val="0000A990"/>
     <w:multiLevelType w:val="multilevel"/>
-    <w:tmpl w:val="593E1F7C"/>
+    <w:tmpl w:val="9D5A33AE"/>
     <w:lvl w:ilvl="0">
       <w:numFmt w:val="bullet"/>
       <w:lvlText w:val=" "/>
@@ -1313,7 +1083,7 @@
   <w:abstractNum w:abstractNumId="1" w15:restartNumberingAfterBreak="0">
     <w:nsid w:val="0000A991"/>
     <w:multiLevelType w:val="multilevel"/>
-    <w:tmpl w:val="208A8FA0"/>
+    <w:tmpl w:val="BB4CEF78"/>
     <w:lvl w:ilvl="0">
       <w:numFmt w:val="bullet"/>
       <w:lvlText w:val=""/>
@@ -1414,22 +1184,19 @@
       </w:rPr>
     </w:lvl>
   </w:abstractNum>
-  <w:num w:numId="1" w16cid:durableId="1656225913">
+  <w:num w:numId="1" w16cid:durableId="642275659">
     <w:abstractNumId w:val="0"/>
   </w:num>
-  <w:num w:numId="2" w16cid:durableId="1207254209">
+  <w:num w:numId="2" w16cid:durableId="1140683302">
     <w:abstractNumId w:val="1"/>
   </w:num>
-  <w:num w:numId="3" w16cid:durableId="151485110">
+  <w:num w:numId="3" w16cid:durableId="266548657">
     <w:abstractNumId w:val="1"/>
   </w:num>
-  <w:num w:numId="4" w16cid:durableId="1505510097">
+  <w:num w:numId="4" w16cid:durableId="1051003034">
     <w:abstractNumId w:val="1"/>
   </w:num>
-  <w:num w:numId="5" w16cid:durableId="1213543410">
-    <w:abstractNumId w:val="1"/>
-  </w:num>
-  <w:num w:numId="6" w16cid:durableId="322198458">
+  <w:num w:numId="5" w16cid:durableId="1176312296">
     <w:abstractNumId w:val="1"/>
   </w:num>
 </w:numbering>
@@ -2940,16 +2707,4 @@
     </a:ext>
   </a:extLst>
 </a:theme>
-</file>
-
-<file path=customXml/item1.xml><?xml version="1.0" encoding="utf-8"?>
-<b:Sources xmlns:b="http://schemas.openxmlformats.org/officeDocument/2006/bibliography" xmlns="http://schemas.openxmlformats.org/officeDocument/2006/bibliography" SelectedStyle="\APASixthEditionOfficeOnline.xsl" StyleName="APA" Version="6"/>
-</file>
-
-<file path=customXml/itemProps1.xml><?xml version="1.0" encoding="utf-8"?>
-<ds:datastoreItem xmlns:ds="http://schemas.openxmlformats.org/officeDocument/2006/customXml" ds:itemID="{99DBC755-23F8-4E09-8CE4-8FE4CDD79F39}">
-  <ds:schemaRefs>
-    <ds:schemaRef ds:uri="http://schemas.openxmlformats.org/officeDocument/2006/bibliography"/>
-  </ds:schemaRefs>
-</ds:datastoreItem>
 </file>
</xml_diff>